<commit_message>
Refocus JAM submission as practical Sharpe diagnostic
</commit_message>
<xml_diff>
--- a/journal_asset_management/JAM_false_precision_main_blinded.docx
+++ b/journal_asset_management/JAM_false_precision_main_blinded.docx
@@ -2,26 +2,13 @@
 <file path=word/document.xml><?xml version="1.0" encoding="utf-8"?>
 <w:document xmlns:w="http://schemas.openxmlformats.org/wordprocessingml/2006/main" xmlns:m="http://schemas.openxmlformats.org/officeDocument/2006/math" xmlns:r="http://schemas.openxmlformats.org/officeDocument/2006/relationships" xmlns:o="urn:schemas-microsoft-com:office:office" xmlns:v="urn:schemas-microsoft-com:vml" xmlns:w10="urn:schemas-microsoft-com:office:word" xmlns:a="http://schemas.openxmlformats.org/drawingml/2006/main" xmlns:pic="http://schemas.openxmlformats.org/drawingml/2006/picture" xmlns:wp="http://schemas.openxmlformats.org/drawingml/2006/wordprocessingDrawing">
   <w:body>
-    <w:p>
-      <w:pPr>
-        <w:pStyle w:val="Title"/>
-      </w:pPr>
-      <w:r>
-        <w:t xml:space="preserve">False Precision in Panel-Based Sharpe Backtests: A Practical Date-Aggregation Diagnostic</w:t>
-      </w:r>
-    </w:p>
-    <w:p>
-      <w:pPr>
-        <w:pStyle w:val="Author"/>
-      </w:pPr>
-    </w:p>
-    <w:bookmarkStart w:id="20" w:name="X79e33807a828e8dba4e8eef40afb236509eb04b"/>
+    <w:bookmarkStart w:id="20" w:name="X254bd6aaabf4018f819f060d8e1be7e0051e4d2"/>
     <w:p>
       <w:pPr>
         <w:pStyle w:val="Heading1"/>
       </w:pPr>
       <w:r>
-        <w:t xml:space="preserve">False Precision in Panel-Based Sharpe Backtests: A Practical Date-Aggregation Diagnostic</w:t>
+        <w:t xml:space="preserve">A Practical Sharpe-Ratio Diagnostic for Portfolio Backtests</w:t>
       </w:r>
     </w:p>
     <w:bookmarkEnd w:id="20"/>
@@ -39,91 +26,97 @@
         <w:pStyle w:val="FirstParagraph"/>
       </w:pPr>
       <w:r>
-        <w:t xml:space="preserve">Panel-based trading screens often evaluate thousands of asset-date</w:t>
-      </w:r>
-      <w:r>
-        <w:t xml:space="preserve"> </w:t>
-      </w:r>
-      <w:r>
-        <w:t xml:space="preserve">observations but realize performance through one portfolio return per</w:t>
-      </w:r>
-      <w:r>
-        <w:t xml:space="preserve"> </w:t>
-      </w:r>
-      <w:r>
-        <w:t xml:space="preserve">date. This article shows how treating selected asset-date rows as</w:t>
-      </w:r>
-      <w:r>
-        <w:t xml:space="preserve"> </w:t>
-      </w:r>
-      <w:r>
-        <w:t xml:space="preserve">independent can overstate the precision of Sharpe-ratio evidence. I</w:t>
-      </w:r>
-      <w:r>
-        <w:t xml:space="preserve"> </w:t>
-      </w:r>
-      <w:r>
-        <w:t xml:space="preserve">propose a practical date-aggregation diagnostic: first convert selected</w:t>
-      </w:r>
-      <w:r>
-        <w:t xml:space="preserve"> </w:t>
-      </w:r>
-      <w:r>
-        <w:t xml:space="preserve">rows into date-level portfolio returns, then evaluate Sharpe evidence</w:t>
-      </w:r>
-      <w:r>
-        <w:t xml:space="preserve"> </w:t>
-      </w:r>
-      <w:r>
-        <w:t xml:space="preserve">using HAC and dependent-bootstrap inference, and finally report the gap</w:t>
-      </w:r>
-      <w:r>
-        <w:t xml:space="preserve"> </w:t>
-      </w:r>
-      <w:r>
-        <w:t xml:space="preserve">between row-pooled and date-level uncertainty. Public Kenneth French and</w:t>
-      </w:r>
-      <w:r>
-        <w:t xml:space="preserve"> </w:t>
-      </w:r>
-      <w:r>
-        <w:t xml:space="preserve">AQR examples illustrate how the diagnostic separates robust benchmark</w:t>
-      </w:r>
-      <w:r>
-        <w:t xml:space="preserve"> </w:t>
-      </w:r>
-      <w:r>
-        <w:t xml:space="preserve">momentum evidence from weaker panel claims. Monte Carlo designs show</w:t>
-      </w:r>
-      <w:r>
-        <w:t xml:space="preserve"> </w:t>
-      </w:r>
-      <w:r>
-        <w:t xml:space="preserve">that row-naive tests can reject about 35 percent of the time at a</w:t>
-      </w:r>
-      <w:r>
-        <w:t xml:space="preserve"> </w:t>
-      </w:r>
-      <w:r>
-        <w:t xml:space="preserve">nominal 5 percent level under dependent nulls with no true edge, while</w:t>
-      </w:r>
-      <w:r>
-        <w:t xml:space="preserve"> </w:t>
-      </w:r>
-      <w:r>
-        <w:t xml:space="preserve">date-level procedures remain much closer to nominal size. The diagnostic</w:t>
-      </w:r>
-      <w:r>
-        <w:t xml:space="preserve"> </w:t>
-      </w:r>
-      <w:r>
-        <w:t xml:space="preserve">is not a new trading rule; it is a reporting check for portfolio</w:t>
-      </w:r>
-      <w:r>
-        <w:t xml:space="preserve"> </w:t>
-      </w:r>
-      <w:r>
-        <w:t xml:space="preserve">researchers, asset managers, and backtest reviewers.</w:t>
+        <w:t xml:space="preserve">Backtests often report strategy Sharpe ratios from panels of selected</w:t>
+      </w:r>
+      <w:r>
+        <w:t xml:space="preserve"> </w:t>
+      </w:r>
+      <w:r>
+        <w:t xml:space="preserve">asset returns. In practice, however, a portfolio earns one aggregate</w:t>
+      </w:r>
+      <w:r>
+        <w:t xml:space="preserve"> </w:t>
+      </w:r>
+      <w:r>
+        <w:t xml:space="preserve">return per period. Treating many same-date selected rows as independent</w:t>
+      </w:r>
+      <w:r>
+        <w:t xml:space="preserve"> </w:t>
+      </w:r>
+      <w:r>
+        <w:t xml:space="preserve">performance observations can therefore make a backtest look more precise</w:t>
+      </w:r>
+      <w:r>
+        <w:t xml:space="preserve"> </w:t>
+      </w:r>
+      <w:r>
+        <w:t xml:space="preserve">than the investor-level return series supports. This article presents a</w:t>
+      </w:r>
+      <w:r>
+        <w:t xml:space="preserve"> </w:t>
+      </w:r>
+      <w:r>
+        <w:t xml:space="preserve">practical Sharpe-ratio diagnostic for portfolio backtests. The procedure</w:t>
+      </w:r>
+      <w:r>
+        <w:t xml:space="preserve"> </w:t>
+      </w:r>
+      <w:r>
+        <w:t xml:space="preserve">aggregates selected rows into date-level portfolio returns, tests Sharpe</w:t>
+      </w:r>
+      <w:r>
+        <w:t xml:space="preserve"> </w:t>
+      </w:r>
+      <w:r>
+        <w:t xml:space="preserve">evidence on that date series using robust inference, and reports how</w:t>
+      </w:r>
+      <w:r>
+        <w:t xml:space="preserve"> </w:t>
+      </w:r>
+      <w:r>
+        <w:t xml:space="preserve">much apparent precision came from row-level counting. Public Kenneth</w:t>
+      </w:r>
+      <w:r>
+        <w:t xml:space="preserve"> </w:t>
+      </w:r>
+      <w:r>
+        <w:t xml:space="preserve">French and AQR examples show how the check preserves strong benchmark</w:t>
+      </w:r>
+      <w:r>
+        <w:t xml:space="preserve"> </w:t>
+      </w:r>
+      <w:r>
+        <w:t xml:space="preserve">momentum evidence while flagging weaker panel claims. Simulation stress</w:t>
+      </w:r>
+      <w:r>
+        <w:t xml:space="preserve"> </w:t>
+      </w:r>
+      <w:r>
+        <w:t xml:space="preserve">tests show that row-naive Sharpe tests can reject about 35 percent of</w:t>
+      </w:r>
+      <w:r>
+        <w:t xml:space="preserve"> </w:t>
+      </w:r>
+      <w:r>
+        <w:t xml:space="preserve">the time at a nominal 5 percent level under dependent null designs with</w:t>
+      </w:r>
+      <w:r>
+        <w:t xml:space="preserve"> </w:t>
+      </w:r>
+      <w:r>
+        <w:t xml:space="preserve">no true edge. The contribution is a backtest-review tool for portfolio</w:t>
+      </w:r>
+      <w:r>
+        <w:t xml:space="preserve"> </w:t>
+      </w:r>
+      <w:r>
+        <w:t xml:space="preserve">researchers, asset managers, and investment due-diligence teams, not a</w:t>
+      </w:r>
+      <w:r>
+        <w:t xml:space="preserve"> </w:t>
+      </w:r>
+      <w:r>
+        <w:t xml:space="preserve">new trading rule or asset-pricing anomaly.</w:t>
       </w:r>
     </w:p>
     <w:p>
@@ -151,22 +144,13 @@
       </w:r>
     </w:p>
     <w:bookmarkEnd w:id="21"/>
-    <w:bookmarkStart w:id="22" w:name="X7debcec1c2ce780c1c13eb1be436c14e451cab6"/>
+    <w:bookmarkStart w:id="22" w:name="X1acd4870a6f96a9ddcfce39b967e01d11868b77"/>
     <w:p>
       <w:pPr>
         <w:pStyle w:val="Heading1"/>
       </w:pPr>
       <w:r>
-        <w:rPr>
-          <w:rStyle w:val="SectionNumber"/>
-        </w:rPr>
-        <w:t xml:space="preserve">1</w:t>
-      </w:r>
-      <w:r>
-        <w:tab/>
-      </w:r>
-      <w:r>
-        <w:t xml:space="preserve">Introduction: false precision in panel Sharpe backtests</w:t>
+        <w:t xml:space="preserve">Introduction: a practical check for false precision</w:t>
       </w:r>
     </w:p>
     <w:p>
@@ -274,19 +258,13 @@
         <w:t xml:space="preserve"> </w:t>
       </w:r>
       <w:r>
-        <w:t xml:space="preserve">It is not a new trading rule, not a new anomaly, not a new Sharpe</w:t>
-      </w:r>
-      <w:r>
-        <w:t xml:space="preserve"> </w:t>
-      </w:r>
-      <w:r>
-        <w:t xml:space="preserve">estimator, and not a replacement for heteroskedasticity-and-</w:t>
-      </w:r>
-      <w:r>
-        <w:t xml:space="preserve"> </w:t>
-      </w:r>
-      <w:r>
-        <w:t xml:space="preserve">autocorrelation consistent (HAC) or bootstrap inference. The contribution</w:t>
+        <w:t xml:space="preserve">It is not a new trading rule, not a new anomaly, and not a claim that one</w:t>
+      </w:r>
+      <w:r>
+        <w:t xml:space="preserve"> </w:t>
+      </w:r>
+      <w:r>
+        <w:t xml:space="preserve">new statistic should replace standard robust inference. The contribution</w:t>
       </w:r>
       <w:r>
         <w:t xml:space="preserve"> </w:t>
@@ -298,7 +276,13 @@
         <w:t xml:space="preserve"> </w:t>
       </w:r>
       <w:r>
-        <w:t xml:space="preserve">Sharpe-ratio evidence is reported at the correct sampling boundary.</w:t>
+        <w:t xml:space="preserve">Sharpe-ratio evidence is reported on the return series an investor could</w:t>
+      </w:r>
+      <w:r>
+        <w:t xml:space="preserve"> </w:t>
+      </w:r>
+      <w:r>
+        <w:t xml:space="preserve">actually receive.</w:t>
       </w:r>
     </w:p>
     <w:p>
@@ -324,7 +308,7 @@
         <w:t xml:space="preserve"> </w:t>
       </w:r>
       <w:r>
-        <w:t xml:space="preserve">dependence-aware inference? Third, how much precision was created by the</w:t>
+        <w:t xml:space="preserve">robust inference? Third, how much precision was created by the</w:t>
       </w:r>
       <w:r>
         <w:t xml:space="preserve"> </w:t>
@@ -336,19 +320,19 @@
         <w:t xml:space="preserve"> </w:t>
       </w:r>
       <w:r>
-        <w:t xml:space="preserve">answer to the third question is summarized by a Sharpe uncertainty</w:t>
-      </w:r>
-      <w:r>
-        <w:t xml:space="preserve"> </w:t>
-      </w:r>
-      <w:r>
-        <w:t xml:space="preserve">inflation diagnostic, denoted Sharpe UVIF. It is a descriptive reporting</w:t>
-      </w:r>
-      <w:r>
-        <w:t xml:space="preserve"> </w:t>
-      </w:r>
-      <w:r>
-        <w:t xml:space="preserve">ratio, not the rejection rule.</w:t>
+        <w:t xml:space="preserve">answer to the third question is reported as a Sharpe uncertainty-</w:t>
+      </w:r>
+      <w:r>
+        <w:t xml:space="preserve"> </w:t>
+      </w:r>
+      <w:r>
+        <w:t xml:space="preserve">inflation check. It is a descriptive warning label, not the rejection</w:t>
+      </w:r>
+      <w:r>
+        <w:t xml:space="preserve"> </w:t>
+      </w:r>
+      <w:r>
+        <w:t xml:space="preserve">rule.</w:t>
       </w:r>
     </w:p>
     <w:p>
@@ -504,7 +488,13 @@
         <w:t xml:space="preserve"> </w:t>
       </w:r>
       <w:r>
-        <w:t xml:space="preserve">practical reporting guidance and limitations.</w:t>
+        <w:t xml:space="preserve">practical reporting guidance and limitations. Algebra and extended</w:t>
+      </w:r>
+      <w:r>
+        <w:t xml:space="preserve"> </w:t>
+      </w:r>
+      <w:r>
+        <w:t xml:space="preserve">tables are left to the technical appendix.</w:t>
       </w:r>
     </w:p>
     <w:bookmarkEnd w:id="22"/>
@@ -513,15 +503,6 @@
       <w:pPr>
         <w:pStyle w:val="Heading1"/>
       </w:pPr>
-      <w:r>
-        <w:rPr>
-          <w:rStyle w:val="SectionNumber"/>
-        </w:rPr>
-        <w:t xml:space="preserve">2</w:t>
-      </w:r>
-      <w:r>
-        <w:tab/>
-      </w:r>
       <w:r>
         <w:t xml:space="preserve">The practical problem: rows are not the payoff boundary</w:t>
       </w:r>
@@ -1126,7 +1107,7 @@
         <w:pStyle w:val="BodyText"/>
       </w:pPr>
       <w:r>
-        <w:t xml:space="preserve">The Sharpe uncertainty inflation diagnostic summarizes the reporting gap:</w:t>
+        <w:t xml:space="preserve">The Sharpe uncertainty-inflation check summarizes the reporting gap:</w:t>
       </w:r>
     </w:p>
     <w:p>
@@ -1138,48 +1119,13 @@
           <m:jc m:val="center"/>
         </m:oMathParaPr>
         <m:oMath>
-          <m:sSub>
-            <m:e>
-              <m:r>
-                <m:rPr>
-                  <m:sty m:val="p"/>
-                </m:rPr>
-                <m:t>U</m:t>
-              </m:r>
-              <m:r>
-                <m:rPr>
-                  <m:sty m:val="p"/>
-                </m:rPr>
-                <m:t>V</m:t>
-              </m:r>
-              <m:r>
-                <m:rPr>
-                  <m:sty m:val="p"/>
-                </m:rPr>
-                <m:t>I</m:t>
-              </m:r>
-              <m:r>
-                <m:rPr>
-                  <m:sty m:val="p"/>
-                </m:rPr>
-                <m:t>F</m:t>
-              </m:r>
-            </m:e>
-            <m:sub>
-              <m:r>
-                <m:rPr>
-                  <m:sty m:val="p"/>
-                </m:rPr>
-                <m:t>S</m:t>
-              </m:r>
-              <m:r>
-                <m:rPr>
-                  <m:sty m:val="p"/>
-                </m:rPr>
-                <m:t>R</m:t>
-              </m:r>
-            </m:sub>
-          </m:sSub>
+          <m:r>
+            <m:rPr>
+              <m:nor/>
+              <m:sty m:val="p"/>
+            </m:rPr>
+            <m:t>Sharpe uncertainty inflation</m:t>
+          </m:r>
           <m:r>
             <m:rPr>
               <m:sty m:val="p"/>
@@ -1223,7 +1169,7 @@
         <w:pStyle w:val="FirstParagraph"/>
       </w:pPr>
       <w:r>
-        <w:t xml:space="preserve">In words, Sharpe UVIF compares the uncertainty attached to the realized</w:t>
+        <w:t xml:space="preserve">In words, the check compares the uncertainty attached to the realized</w:t>
       </w:r>
       <w:r>
         <w:t xml:space="preserve"> </w:t>
@@ -1253,38 +1199,29 @@
         <w:t xml:space="preserve"> </w:t>
       </w:r>
       <w:r>
-        <w:t xml:space="preserve">reported decision still comes from HAC, bootstrap, menu, placebo, and</w:t>
-      </w:r>
-      <w:r>
-        <w:t xml:space="preserve"> </w:t>
-      </w:r>
-      <w:r>
-        <w:t xml:space="preserve">cost checks at the date-return boundary. The technical appendix gives</w:t>
-      </w:r>
-      <w:r>
-        <w:t xml:space="preserve"> </w:t>
-      </w:r>
-      <w:r>
-        <w:t xml:space="preserve">the delta-method derivation for readers who want the algebra.</w:t>
+        <w:t xml:space="preserve">reported decision still comes from robust date-level inference, menu</w:t>
+      </w:r>
+      <w:r>
+        <w:t xml:space="preserve"> </w:t>
+      </w:r>
+      <w:r>
+        <w:t xml:space="preserve">adjustment, placebo checks, and turnover-cost sensitivity. The technical</w:t>
+      </w:r>
+      <w:r>
+        <w:t xml:space="preserve"> </w:t>
+      </w:r>
+      <w:r>
+        <w:t xml:space="preserve">appendix gives the formal version for readers who want the algebra.</w:t>
       </w:r>
     </w:p>
     <w:bookmarkEnd w:id="23"/>
-    <w:bookmarkStart w:id="24" w:name="X85bd9703406432247dfacddb4a19f0f9d3a410b"/>
+    <w:bookmarkStart w:id="24" w:name="Xeeaf2c765e458e2eaa6dc0a36b07ce2d8701de4"/>
     <w:p>
       <w:pPr>
         <w:pStyle w:val="Heading1"/>
       </w:pPr>
       <w:r>
-        <w:rPr>
-          <w:rStyle w:val="SectionNumber"/>
-        </w:rPr>
-        <w:t xml:space="preserve">3</w:t>
-      </w:r>
-      <w:r>
-        <w:tab/>
-      </w:r>
-      <w:r>
-        <w:t xml:space="preserve">Diagnostic workflow for portfolio evaluation</w:t>
+        <w:t xml:space="preserve">Diagnostic workflow for portfolio evaluators</w:t>
       </w:r>
     </w:p>
     <w:p>
@@ -1406,39 +1343,31 @@
           <w:b/>
           <w:bCs/>
         </w:rPr>
-        <w:t xml:space="preserve">Fourth, use HAC or dependent-bootstrap inference on the date</w:t>
-      </w:r>
-      <w:r>
-        <w:rPr>
-          <w:b/>
-          <w:bCs/>
-        </w:rPr>
-        <w:t xml:space="preserve"> </w:t>
-      </w:r>
-      <w:r>
-        <w:rPr>
-          <w:b/>
-          <w:bCs/>
-        </w:rPr>
-        <w:t xml:space="preserve">series.</w:t>
-      </w:r>
-      <w:r>
-        <w:t xml:space="preserve"> </w:t>
-      </w:r>
-      <w:r>
-        <w:t xml:space="preserve">The public implementation reports HAC-delta inference, moving-</w:t>
-      </w:r>
-      <w:r>
-        <w:t xml:space="preserve"> </w:t>
-      </w:r>
-      <w:r>
-        <w:t xml:space="preserve">block bootstrap, and stationary bootstrap evidence. The date-IID</w:t>
-      </w:r>
-      <w:r>
-        <w:t xml:space="preserve"> </w:t>
-      </w:r>
-      <w:r>
-        <w:t xml:space="preserve">bootstrap is retained as a comparator.</w:t>
+        <w:t xml:space="preserve">Fourth, use robust inference on the date series.</w:t>
+      </w:r>
+      <w:r>
+        <w:t xml:space="preserve"> </w:t>
+      </w:r>
+      <w:r>
+        <w:t xml:space="preserve">The public</w:t>
+      </w:r>
+      <w:r>
+        <w:t xml:space="preserve"> </w:t>
+      </w:r>
+      <w:r>
+        <w:t xml:space="preserve">implementation reports HAC standard errors, moving-block bootstrap, and</w:t>
+      </w:r>
+      <w:r>
+        <w:t xml:space="preserve"> </w:t>
+      </w:r>
+      <w:r>
+        <w:t xml:space="preserve">stationary bootstrap evidence. The date-IID bootstrap is retained as a</w:t>
+      </w:r>
+      <w:r>
+        <w:t xml:space="preserve"> </w:t>
+      </w:r>
+      <w:r>
+        <w:t xml:space="preserve">comparator.</w:t>
       </w:r>
     </w:p>
     <w:p>
@@ -1609,23 +1538,96 @@
         <w:t xml:space="preserve">not as a confirmatory portfolio result.</w:t>
       </w:r>
     </w:p>
+    <w:p>
+      <w:pPr>
+        <w:pStyle w:val="BodyText"/>
+      </w:pPr>
+      <w:r>
+        <w:t xml:space="preserve">The same workflow can be summarized as portfolio-review pseudocode:</w:t>
+      </w:r>
+    </w:p>
+    <w:p>
+      <w:pPr>
+        <w:pStyle w:val="SourceCode"/>
+      </w:pPr>
+      <w:r>
+        <w:rPr>
+          <w:rStyle w:val="VerbatimChar"/>
+        </w:rPr>
+        <w:t xml:space="preserve">input: selected rows with date, asset, weight, and next-period return</w:t>
+      </w:r>
+      <w:r>
+        <w:br/>
+      </w:r>
+      <w:r>
+        <w:rPr>
+          <w:rStyle w:val="VerbatimChar"/>
+        </w:rPr>
+        <w:t xml:space="preserve">for each date:</w:t>
+      </w:r>
+      <w:r>
+        <w:br/>
+      </w:r>
+      <w:r>
+        <w:rPr>
+          <w:rStyle w:val="VerbatimChar"/>
+        </w:rPr>
+        <w:t xml:space="preserve">    aggregate selected rows into one portfolio return</w:t>
+      </w:r>
+      <w:r>
+        <w:br/>
+      </w:r>
+      <w:r>
+        <w:rPr>
+          <w:rStyle w:val="VerbatimChar"/>
+        </w:rPr>
+        <w:t xml:space="preserve">compute the date-level Sharpe ratio</w:t>
+      </w:r>
+      <w:r>
+        <w:br/>
+      </w:r>
+      <w:r>
+        <w:rPr>
+          <w:rStyle w:val="VerbatimChar"/>
+        </w:rPr>
+        <w:t xml:space="preserve">test the date-level Sharpe using HAC or a dependent bootstrap</w:t>
+      </w:r>
+      <w:r>
+        <w:br/>
+      </w:r>
+      <w:r>
+        <w:rPr>
+          <w:rStyle w:val="VerbatimChar"/>
+        </w:rPr>
+        <w:t xml:space="preserve">compute the row-naive Sharpe test only as a comparator</w:t>
+      </w:r>
+      <w:r>
+        <w:br/>
+      </w:r>
+      <w:r>
+        <w:rPr>
+          <w:rStyle w:val="VerbatimChar"/>
+        </w:rPr>
+        <w:t xml:space="preserve">report the row/date uncertainty gap, placebo result, and cost stress</w:t>
+      </w:r>
+      <w:r>
+        <w:br/>
+      </w:r>
+      <w:r>
+        <w:rPr>
+          <w:rStyle w:val="VerbatimChar"/>
+        </w:rPr>
+        <w:t xml:space="preserve">classify the backtest as robust, fragile, or failed</w:t>
+      </w:r>
+    </w:p>
     <w:bookmarkEnd w:id="24"/>
-    <w:bookmarkStart w:id="28" w:name="worked-public-examples"/>
+    <w:bookmarkStart w:id="28" w:name="worked-examples-with-public-data"/>
     <w:p>
       <w:pPr>
         <w:pStyle w:val="Heading1"/>
       </w:pPr>
       <w:r>
-        <w:rPr>
-          <w:rStyle w:val="SectionNumber"/>
-        </w:rPr>
-        <w:t xml:space="preserve">4</w:t>
-      </w:r>
-      <w:r>
-        <w:tab/>
-      </w:r>
-      <w:r>
-        <w:t xml:space="preserve">Worked public examples</w:t>
+        <w:t xml:space="preserve">Worked examples with public data</w:t>
       </w:r>
     </w:p>
     <w:p>
@@ -1677,15 +1679,6 @@
       <w:pPr>
         <w:pStyle w:val="Heading2"/>
       </w:pPr>
-      <w:r>
-        <w:rPr>
-          <w:rStyle w:val="SectionNumber"/>
-        </w:rPr>
-        <w:t xml:space="preserve">4.1</w:t>
-      </w:r>
-      <w:r>
-        <w:tab/>
-      </w:r>
       <w:r>
         <w:t xml:space="preserve">Case 1: canonical WML momentum survives</w:t>
       </w:r>
@@ -1741,15 +1734,6 @@
         <w:pStyle w:val="Heading2"/>
       </w:pPr>
       <w:r>
-        <w:rPr>
-          <w:rStyle w:val="SectionNumber"/>
-        </w:rPr>
-        <w:t xml:space="preserve">4.2</w:t>
-      </w:r>
-      <w:r>
-        <w:tab/>
-      </w:r>
-      <w:r>
         <w:t xml:space="preserve">Case 2: a weaker panel claim fails</w:t>
       </w:r>
     </w:p>
@@ -1791,15 +1775,6 @@
       <w:pPr>
         <w:pStyle w:val="Heading2"/>
       </w:pPr>
-      <w:r>
-        <w:rPr>
-          <w:rStyle w:val="SectionNumber"/>
-        </w:rPr>
-        <w:t xml:space="preserve">4.3</w:t>
-      </w:r>
-      <w:r>
-        <w:tab/>
-      </w:r>
       <w:r>
         <w:t xml:space="preserve">Case 3: AQR factor series are time-series benchmarks only</w:t>
       </w:r>
@@ -1921,7 +1896,7 @@
         <w:t xml:space="preserve"> </w:t>
       </w:r>
       <w:r>
-        <w:t xml:space="preserve">p+ denotes a one-sided positive-Sharpe p-value. Row-naive p+ treats selected asset-date rows as independent. Date-IID, Date-HAC, and Moving-block p+ operate on the date-level portfolio return series. Sharpe UVIF is the diagnostic variance ratio between date-level long-run Sharpe uncertainty and row-pooled IID Sharpe uncertainty.</w:t>
+        <w:t xml:space="preserve">p+ denotes a one-sided positive-Sharpe p-value. Row-naive p+ treats selected asset-date rows as independent. Date-IID, Date-HAC, and Moving-block p+ operate on the date-level portfolio return series. Uncertainty infl. is the diagnostic variance ratio between date-level long-run Sharpe uncertainty and row-pooled IID Sharpe uncertainty.</w:t>
       </w:r>
     </w:p>
     <w:bookmarkEnd w:id="27"/>
@@ -1931,15 +1906,6 @@
       <w:pPr>
         <w:pStyle w:val="Heading1"/>
       </w:pPr>
-      <w:r>
-        <w:rPr>
-          <w:rStyle w:val="SectionNumber"/>
-        </w:rPr>
-        <w:t xml:space="preserve">5</w:t>
-      </w:r>
-      <w:r>
-        <w:tab/>
-      </w:r>
       <w:r>
         <w:t xml:space="preserve">How large can the false-precision problem be?</w:t>
       </w:r>
@@ -2172,15 +2138,6 @@
         <w:pStyle w:val="Heading1"/>
       </w:pPr>
       <w:r>
-        <w:rPr>
-          <w:rStyle w:val="SectionNumber"/>
-        </w:rPr>
-        <w:t xml:space="preserve">6</w:t>
-      </w:r>
-      <w:r>
-        <w:tab/>
-      </w:r>
-      <w:r>
         <w:t xml:space="preserve">Practical guidance and limitations</w:t>
       </w:r>
     </w:p>
@@ -2311,15 +2268,6 @@
         <w:pStyle w:val="Heading1"/>
       </w:pPr>
       <w:r>
-        <w:rPr>
-          <w:rStyle w:val="SectionNumber"/>
-        </w:rPr>
-        <w:t xml:space="preserve">7</w:t>
-      </w:r>
-      <w:r>
-        <w:tab/>
-      </w:r>
-      <w:r>
         <w:t xml:space="preserve">Conclusion</w:t>
       </w:r>
     </w:p>
@@ -2412,25 +2360,7 @@
         <w:pStyle w:val="FirstParagraph"/>
       </w:pPr>
       <w:r>
-        <w:t xml:space="preserve">For double-blind review, the public repository URL is omitted from the</w:t>
-      </w:r>
-      <w:r>
-        <w:t xml:space="preserve"> </w:t>
-      </w:r>
-      <w:r>
-        <w:t xml:space="preserve">manuscript. An anonymized reproducibility package is supplied separately</w:t>
-      </w:r>
-      <w:r>
-        <w:t xml:space="preserve"> </w:t>
-      </w:r>
-      <w:r>
-        <w:t xml:space="preserve">for refereeing; the public repository URL is provided on the title page</w:t>
-      </w:r>
-      <w:r>
-        <w:t xml:space="preserve"> </w:t>
-      </w:r>
-      <w:r>
-        <w:t xml:space="preserve">and can be inserted into the manuscript after review if required.</w:t>
+        <w:t xml:space="preserve">For double-blind review, the public repository URL is omitted from the manuscript. An anonymized reproducibility package is supplied separately for refereeing; the public repository URL is provided on the title page and can be inserted into the manuscript after review if required.</w:t>
       </w:r>
       <w:r>
         <w:t xml:space="preserve"> </w:t>
@@ -2466,13 +2396,7 @@
         <w:pStyle w:val="FirstParagraph"/>
       </w:pPr>
       <w:r>
-        <w:t xml:space="preserve">Acknowledgments are omitted from the review manuscript to preserve</w:t>
-      </w:r>
-      <w:r>
-        <w:t xml:space="preserve"> </w:t>
-      </w:r>
-      <w:r>
-        <w:t xml:space="preserve">double-blind anonymity.</w:t>
+        <w:t xml:space="preserve">Acknowledgments are omitted from the review manuscript to preserve double-blind anonymity.</w:t>
       </w:r>
       <w:r>
         <w:t xml:space="preserve"> </w:t>

</xml_diff>

<commit_message>
Set JAM submission title to false precision diagnostic
</commit_message>
<xml_diff>
--- a/journal_asset_management/JAM_false_precision_main_blinded.docx
+++ b/journal_asset_management/JAM_false_precision_main_blinded.docx
@@ -2,13 +2,13 @@
 <file path=word/document.xml><?xml version="1.0" encoding="utf-8"?>
 <w:document xmlns:w="http://schemas.openxmlformats.org/wordprocessingml/2006/main" xmlns:m="http://schemas.openxmlformats.org/officeDocument/2006/math" xmlns:r="http://schemas.openxmlformats.org/officeDocument/2006/relationships" xmlns:o="urn:schemas-microsoft-com:office:office" xmlns:v="urn:schemas-microsoft-com:vml" xmlns:w10="urn:schemas-microsoft-com:office:word" xmlns:a="http://schemas.openxmlformats.org/drawingml/2006/main" xmlns:pic="http://schemas.openxmlformats.org/drawingml/2006/picture" xmlns:wp="http://schemas.openxmlformats.org/drawingml/2006/wordprocessingDrawing">
   <w:body>
-    <w:bookmarkStart w:id="20" w:name="X254bd6aaabf4018f819f060d8e1be7e0051e4d2"/>
+    <w:bookmarkStart w:id="20" w:name="X79e33807a828e8dba4e8eef40afb236509eb04b"/>
     <w:p>
       <w:pPr>
         <w:pStyle w:val="Heading1"/>
       </w:pPr>
       <w:r>
-        <w:t xml:space="preserve">A Practical Sharpe-Ratio Diagnostic for Portfolio Backtests</w:t>
+        <w:t xml:space="preserve">False Precision in Panel-Based Sharpe Backtests: A Practical Date-Aggregation Diagnostic</w:t>
       </w:r>
     </w:p>
     <w:bookmarkEnd w:id="20"/>
@@ -26,97 +26,97 @@
         <w:pStyle w:val="FirstParagraph"/>
       </w:pPr>
       <w:r>
-        <w:t xml:space="preserve">Backtests often report strategy Sharpe ratios from panels of selected</w:t>
-      </w:r>
-      <w:r>
-        <w:t xml:space="preserve"> </w:t>
-      </w:r>
-      <w:r>
-        <w:t xml:space="preserve">asset returns. In practice, however, a portfolio earns one aggregate</w:t>
-      </w:r>
-      <w:r>
-        <w:t xml:space="preserve"> </w:t>
-      </w:r>
-      <w:r>
-        <w:t xml:space="preserve">return per period. Treating many same-date selected rows as independent</w:t>
-      </w:r>
-      <w:r>
-        <w:t xml:space="preserve"> </w:t>
-      </w:r>
-      <w:r>
-        <w:t xml:space="preserve">performance observations can therefore make a backtest look more precise</w:t>
-      </w:r>
-      <w:r>
-        <w:t xml:space="preserve"> </w:t>
-      </w:r>
-      <w:r>
-        <w:t xml:space="preserve">than the investor-level return series supports. This article presents a</w:t>
-      </w:r>
-      <w:r>
-        <w:t xml:space="preserve"> </w:t>
-      </w:r>
-      <w:r>
-        <w:t xml:space="preserve">practical Sharpe-ratio diagnostic for portfolio backtests. The procedure</w:t>
-      </w:r>
-      <w:r>
-        <w:t xml:space="preserve"> </w:t>
-      </w:r>
-      <w:r>
-        <w:t xml:space="preserve">aggregates selected rows into date-level portfolio returns, tests Sharpe</w:t>
-      </w:r>
-      <w:r>
-        <w:t xml:space="preserve"> </w:t>
-      </w:r>
-      <w:r>
-        <w:t xml:space="preserve">evidence on that date series using robust inference, and reports how</w:t>
-      </w:r>
-      <w:r>
-        <w:t xml:space="preserve"> </w:t>
-      </w:r>
-      <w:r>
-        <w:t xml:space="preserve">much apparent precision came from row-level counting. Public Kenneth</w:t>
-      </w:r>
-      <w:r>
-        <w:t xml:space="preserve"> </w:t>
-      </w:r>
-      <w:r>
-        <w:t xml:space="preserve">French and AQR examples show how the check preserves strong benchmark</w:t>
-      </w:r>
-      <w:r>
-        <w:t xml:space="preserve"> </w:t>
-      </w:r>
-      <w:r>
-        <w:t xml:space="preserve">momentum evidence while flagging weaker panel claims. Simulation stress</w:t>
-      </w:r>
-      <w:r>
-        <w:t xml:space="preserve"> </w:t>
-      </w:r>
-      <w:r>
-        <w:t xml:space="preserve">tests show that row-naive Sharpe tests can reject about 35 percent of</w:t>
-      </w:r>
-      <w:r>
-        <w:t xml:space="preserve"> </w:t>
-      </w:r>
-      <w:r>
-        <w:t xml:space="preserve">the time at a nominal 5 percent level under dependent null designs with</w:t>
-      </w:r>
-      <w:r>
-        <w:t xml:space="preserve"> </w:t>
-      </w:r>
-      <w:r>
-        <w:t xml:space="preserve">no true edge. The contribution is a backtest-review tool for portfolio</w:t>
-      </w:r>
-      <w:r>
-        <w:t xml:space="preserve"> </w:t>
-      </w:r>
-      <w:r>
-        <w:t xml:space="preserve">researchers, asset managers, and investment due-diligence teams, not a</w:t>
-      </w:r>
-      <w:r>
-        <w:t xml:space="preserve"> </w:t>
-      </w:r>
-      <w:r>
-        <w:t xml:space="preserve">new trading rule or asset-pricing anomaly.</w:t>
+        <w:t xml:space="preserve">Panel-based backtests often report Sharpe ratios after evaluating many</w:t>
+      </w:r>
+      <w:r>
+        <w:t xml:space="preserve"> </w:t>
+      </w:r>
+      <w:r>
+        <w:t xml:space="preserve">selected asset-date rows. In practice, however, a portfolio earns one</w:t>
+      </w:r>
+      <w:r>
+        <w:t xml:space="preserve"> </w:t>
+      </w:r>
+      <w:r>
+        <w:t xml:space="preserve">aggregate return per period. Treating same-date rows as independent</w:t>
+      </w:r>
+      <w:r>
+        <w:t xml:space="preserve"> </w:t>
+      </w:r>
+      <w:r>
+        <w:t xml:space="preserve">performance observations can therefore create false precision. This</w:t>
+      </w:r>
+      <w:r>
+        <w:t xml:space="preserve"> </w:t>
+      </w:r>
+      <w:r>
+        <w:t xml:space="preserve">article provides a practical date-aggregation diagnostic for portfolio</w:t>
+      </w:r>
+      <w:r>
+        <w:t xml:space="preserve"> </w:t>
+      </w:r>
+      <w:r>
+        <w:t xml:space="preserve">researchers, asset managers, and backtest reviewers. The workflow first</w:t>
+      </w:r>
+      <w:r>
+        <w:t xml:space="preserve"> </w:t>
+      </w:r>
+      <w:r>
+        <w:t xml:space="preserve">aggregates selected rows into date-level portfolio returns, then tests</w:t>
+      </w:r>
+      <w:r>
+        <w:t xml:space="preserve"> </w:t>
+      </w:r>
+      <w:r>
+        <w:t xml:space="preserve">Sharpe evidence on that investor-level series using robust inference,</w:t>
+      </w:r>
+      <w:r>
+        <w:t xml:space="preserve"> </w:t>
+      </w:r>
+      <w:r>
+        <w:t xml:space="preserve">and finally reports the gap between row-pooled and date-level</w:t>
+      </w:r>
+      <w:r>
+        <w:t xml:space="preserve"> </w:t>
+      </w:r>
+      <w:r>
+        <w:t xml:space="preserve">uncertainty. Public Kenneth French and AQR examples show how the audit</w:t>
+      </w:r>
+      <w:r>
+        <w:t xml:space="preserve"> </w:t>
+      </w:r>
+      <w:r>
+        <w:t xml:space="preserve">preserves strong benchmark momentum evidence while flagging weaker panel</w:t>
+      </w:r>
+      <w:r>
+        <w:t xml:space="preserve"> </w:t>
+      </w:r>
+      <w:r>
+        <w:t xml:space="preserve">claims and pre-aggregated cases where row-level diagnostics are not</w:t>
+      </w:r>
+      <w:r>
+        <w:t xml:space="preserve"> </w:t>
+      </w:r>
+      <w:r>
+        <w:t xml:space="preserve">available. Simulation stress tests show that row-naive Sharpe tests can</w:t>
+      </w:r>
+      <w:r>
+        <w:t xml:space="preserve"> </w:t>
+      </w:r>
+      <w:r>
+        <w:t xml:space="preserve">reject about 35 percent of the time at a nominal 5 percent level under</w:t>
+      </w:r>
+      <w:r>
+        <w:t xml:space="preserve"> </w:t>
+      </w:r>
+      <w:r>
+        <w:t xml:space="preserve">dependent null designs with no true edge. The paper is a due-diligence</w:t>
+      </w:r>
+      <w:r>
+        <w:t xml:space="preserve"> </w:t>
+      </w:r>
+      <w:r>
+        <w:t xml:space="preserve">workflow, not a new trading rule or asset-pricing anomaly.</w:t>
       </w:r>
     </w:p>
     <w:p>
@@ -246,13 +246,13 @@
         <w:pStyle w:val="BodyText"/>
       </w:pPr>
       <w:r>
-        <w:t xml:space="preserve">This article is intended as a practical reporting tool for portfolio</w:t>
-      </w:r>
-      <w:r>
-        <w:t xml:space="preserve"> </w:t>
-      </w:r>
-      <w:r>
-        <w:t xml:space="preserve">researchers and asset managers who evaluate panel-based trading signals.</w:t>
+        <w:t xml:space="preserve">This article provides a practical audit workflow for portfolio</w:t>
+      </w:r>
+      <w:r>
+        <w:t xml:space="preserve"> </w:t>
+      </w:r>
+      <w:r>
+        <w:t xml:space="preserve">researchers and asset managers reviewing panel-based Sharpe backtests.</w:t>
       </w:r>
       <w:r>
         <w:t xml:space="preserve"> </w:t>
@@ -270,19 +270,19 @@
         <w:t xml:space="preserve"> </w:t>
       </w:r>
       <w:r>
-        <w:t xml:space="preserve">is a reproducible backtest-review workflow for checking whether</w:t>
-      </w:r>
-      <w:r>
-        <w:t xml:space="preserve"> </w:t>
-      </w:r>
-      <w:r>
-        <w:t xml:space="preserve">Sharpe-ratio evidence is reported on the return series an investor could</w:t>
-      </w:r>
-      <w:r>
-        <w:t xml:space="preserve"> </w:t>
-      </w:r>
-      <w:r>
-        <w:t xml:space="preserve">actually receive.</w:t>
+        <w:t xml:space="preserve">is operational: it tells a reviewer how to check whether Sharpe-ratio</w:t>
+      </w:r>
+      <w:r>
+        <w:t xml:space="preserve"> </w:t>
+      </w:r>
+      <w:r>
+        <w:t xml:space="preserve">evidence is reported on the return series an investor could actually</w:t>
+      </w:r>
+      <w:r>
+        <w:t xml:space="preserve"> </w:t>
+      </w:r>
+      <w:r>
+        <w:t xml:space="preserve">receive.</w:t>
       </w:r>
     </w:p>
     <w:p>
@@ -1215,13 +1215,13 @@
       </w:r>
     </w:p>
     <w:bookmarkEnd w:id="23"/>
-    <w:bookmarkStart w:id="24" w:name="Xeeaf2c765e458e2eaa6dc0a36b07ce2d8701de4"/>
+    <w:bookmarkStart w:id="24" w:name="a-portfolio-backtest-audit-workflow"/>
     <w:p>
       <w:pPr>
         <w:pStyle w:val="Heading1"/>
       </w:pPr>
       <w:r>
-        <w:t xml:space="preserve">Diagnostic workflow for portfolio evaluators</w:t>
+        <w:t xml:space="preserve">A portfolio backtest audit workflow</w:t>
       </w:r>
     </w:p>
     <w:p>

</xml_diff>